<commit_message>
feat: Update hackathons and projects, add new resume, and reorder projects
</commit_message>
<xml_diff>
--- a/public/ResumeAayush.docx
+++ b/public/ResumeAayush.docx
@@ -270,7 +270,13 @@
         <w:tab/>
       </w:r>
       <w:r>
-        <w:t>Aug 2025 – May 2026</w:t>
+        <w:t xml:space="preserve">Aug 2025 – </w:t>
+      </w:r>
+      <w:r>
+        <w:t>April</w:t>
+      </w:r>
+      <w:r>
+        <w:t xml:space="preserve"> 2026</w:t>
       </w:r>
     </w:p>
     <w:p>
@@ -770,6 +776,16 @@
           <w:sz w:val="24"/>
           <w:szCs w:val="24"/>
         </w:rPr>
+        <w:t xml:space="preserve">Notable </w:t>
+      </w:r>
+      <w:r>
+        <w:rPr>
+          <w:b/>
+          <w:bCs/>
+          <w:color w:val="00B0F0"/>
+          <w:sz w:val="24"/>
+          <w:szCs w:val="24"/>
+        </w:rPr>
         <w:t>Projects</w:t>
       </w:r>
       <w:r>
@@ -784,7 +800,7 @@
           <w:sz w:val="20"/>
           <w:szCs w:val="20"/>
         </w:rPr>
-        <w:t>________________</w:t>
+        <w:t>_____</w:t>
       </w:r>
     </w:p>
     <w:p>
@@ -804,7 +820,21 @@
           <w:b/>
           <w:spacing w:val="-2"/>
         </w:rPr>
-        <w:t>DUMPS (React, TypeScript, Vite, Tailwind CSS, FastAPI, PostgreSQL, AWS (EC2, S3), Nginx, Cloudflare)</w:t>
+        <w:t>DUMPS (React, TypeScript, Vite, Tailwind CSS, FastAPI, PostgreSQL, AWS (EC2, S3), Nginx, Cloudflare</w:t>
+      </w:r>
+      <w:r>
+        <w:rPr>
+          <w:b/>
+          <w:spacing w:val="-2"/>
+        </w:rPr>
+        <w:t>, CI/CD</w:t>
+      </w:r>
+      <w:r>
+        <w:rPr>
+          <w:b/>
+          <w:spacing w:val="-2"/>
+        </w:rPr>
+        <w:t>)</w:t>
       </w:r>
     </w:p>
     <w:p>
@@ -992,7 +1022,13 @@
         <w:jc w:val="both"/>
       </w:pPr>
       <w:r>
-        <w:t>Implemented weighted graph pathfinding to optimize route selection between stairs and elevators, replacing traditional GPS/3D maps with a scalable photo-based navigation solution</w:t>
+        <w:t>Implemented weighted graph pathfinding to optimize route selection</w:t>
+      </w:r>
+      <w:r>
+        <w:t xml:space="preserve"> </w:t>
+      </w:r>
+      <w:r>
+        <w:t>between stairs and elevators, replacing traditional GPS/3D maps with a scalable photo-based navigation solution</w:t>
       </w:r>
     </w:p>
     <w:p>
@@ -1098,19 +1134,8 @@
           <w:sz w:val="22"/>
           <w:szCs w:val="22"/>
         </w:rPr>
-        <w:t xml:space="preserve">Organizing Lead, </w:t>
-      </w:r>
-      <w:proofErr w:type="spellStart"/>
-      <w:r>
-        <w:rPr>
-          <w:rStyle w:val="Strong"/>
-          <w:rFonts w:asciiTheme="minorHAnsi" w:eastAsiaTheme="majorEastAsia" w:hAnsiTheme="minorHAnsi"/>
-          <w:sz w:val="22"/>
-          <w:szCs w:val="22"/>
-        </w:rPr>
-        <w:t>HackSLC</w:t>
-      </w:r>
-      <w:proofErr w:type="spellEnd"/>
+        <w:t>Organizing Lead, HackSLC</w:t>
+      </w:r>
       <w:r>
         <w:rPr>
           <w:rFonts w:asciiTheme="minorHAnsi" w:hAnsiTheme="minorHAnsi"/>
@@ -1253,9 +1278,24 @@
           <w:sz w:val="22"/>
           <w:szCs w:val="22"/>
         </w:rPr>
-        <w:t xml:space="preserve">Participated in multiple hackathons including </w:t>
-      </w:r>
-      <w:proofErr w:type="spellStart"/>
+        <w:t>Participated in</w:t>
+      </w:r>
+      <w:r>
+        <w:rPr>
+          <w:rFonts w:asciiTheme="minorHAnsi" w:hAnsiTheme="minorHAnsi"/>
+          <w:sz w:val="22"/>
+          <w:szCs w:val="22"/>
+        </w:rPr>
+        <w:t xml:space="preserve"> 5+</w:t>
+      </w:r>
+      <w:r>
+        <w:rPr>
+          <w:rFonts w:asciiTheme="minorHAnsi" w:hAnsiTheme="minorHAnsi"/>
+          <w:sz w:val="22"/>
+          <w:szCs w:val="22"/>
+        </w:rPr>
+        <w:t xml:space="preserve"> hackathons including </w:t>
+      </w:r>
       <w:r>
         <w:rPr>
           <w:rStyle w:val="Strong"/>
@@ -1265,7 +1305,6 @@
         </w:rPr>
         <w:t>QHacks</w:t>
       </w:r>
-      <w:proofErr w:type="spellEnd"/>
       <w:r>
         <w:rPr>
           <w:rFonts w:asciiTheme="minorHAnsi" w:hAnsiTheme="minorHAnsi"/>
@@ -1281,7 +1320,7 @@
           <w:sz w:val="22"/>
           <w:szCs w:val="22"/>
         </w:rPr>
-        <w:t>Toronto Stupid Hackathon</w:t>
+        <w:t>AI Collective hackathon</w:t>
       </w:r>
       <w:r>
         <w:rPr>
@@ -1349,7 +1388,6 @@
           <w:szCs w:val="22"/>
         </w:rPr>
       </w:pPr>
-      <w:proofErr w:type="spellStart"/>
       <w:r>
         <w:rPr>
           <w:rFonts w:asciiTheme="minorHAnsi" w:eastAsia="Century Gothic" w:hAnsiTheme="minorHAnsi"/>
@@ -1360,7 +1398,6 @@
         </w:rPr>
         <w:t>Numaflow</w:t>
       </w:r>
-      <w:proofErr w:type="spellEnd"/>
       <w:r>
         <w:rPr>
           <w:rFonts w:asciiTheme="minorHAnsi" w:eastAsia="Century Gothic" w:hAnsiTheme="minorHAnsi"/>
@@ -1430,35 +1467,7 @@
         <w:rPr>
           <w:rFonts w:eastAsia="Times New Roman" w:cs="Times New Roman"/>
         </w:rPr>
-        <w:t xml:space="preserve">Contributed to a cloud-native data processing platform by optimizing </w:t>
-      </w:r>
-      <w:proofErr w:type="spellStart"/>
-      <w:r>
-        <w:rPr>
-          <w:rFonts w:eastAsia="Times New Roman" w:cs="Times New Roman"/>
-        </w:rPr>
-        <w:t>Dockerfiles</w:t>
-      </w:r>
-      <w:proofErr w:type="spellEnd"/>
-      <w:r>
-        <w:rPr>
-          <w:rFonts w:eastAsia="Times New Roman" w:cs="Times New Roman"/>
-        </w:rPr>
-        <w:t xml:space="preserve">, improving </w:t>
-      </w:r>
-      <w:proofErr w:type="spellStart"/>
-      <w:r>
-        <w:rPr>
-          <w:rFonts w:eastAsia="Times New Roman" w:cs="Times New Roman"/>
-        </w:rPr>
-        <w:t>gRPC</w:t>
-      </w:r>
-      <w:proofErr w:type="spellEnd"/>
-      <w:r>
-        <w:rPr>
-          <w:rFonts w:eastAsia="Times New Roman" w:cs="Times New Roman"/>
-        </w:rPr>
-        <w:t xml:space="preserve"> error handling, enhancing Python SDK functionality, and fixing technical documentation issues.</w:t>
+        <w:t>Contributed to a cloud-native data processing platform by optimizing Dockerfiles, improving gRPC error handling, enhancing Python SDK functionality, and fixing technical documentation issues.</w:t>
       </w:r>
     </w:p>
     <w:sectPr>
@@ -3888,6 +3897,7 @@
   <w:style w:type="character" w:default="1" w:styleId="DefaultParagraphFont">
     <w:name w:val="Default Paragraph Font"/>
     <w:uiPriority w:val="1"/>
+    <w:semiHidden/>
     <w:unhideWhenUsed/>
   </w:style>
   <w:style w:type="table" w:default="1" w:styleId="TableNormal">

</xml_diff>